<commit_message>
E01-E03: clean timing rerun of all 144 Phase 2 configs
All 80 baseline and 64 benchmark configs rerun from c450c3e (timed fit without tracemalloc).
All 6,516 non-timing metric values and all parameters are identical to the first runs
(1817c5a, 36c56a1), which stay in MLflow and history.csv. Tables, E01-E03 (addenda), report
section 4, DOCX and notebook 02 now use the rerun timings.
</commit_message>
<xml_diff>
--- a/reports/report/drafts/BlindSpy_report_section_4.docx
+++ b/reports/report/drafts/BlindSpy_report_section_4.docx
@@ -19,7 +19,7 @@
           <w:i/>
           <w:iCs/>
         </w:rPr>
-        <w:t xml:space="preserve">Working draft. The Google Docs report is the master copy; this text is pasted there and kept in sync. Every table here is copied unchanged from reports/baseline_tables.md, which scripts/results_tables.py generates from reports/history.csv (all MLflow runs, exported by scripts/export_history.py). Every number cites its experiment (E01-E03 entries in reports/EXPERIMENT_LOG.md). Data version: v1. Code: tag v0.1-baseline (commit 1817c5a) for the 80 baseline runs; commit 36c56a1 for the 64 paper-benchmark runs.</w:t>
+        <w:t xml:space="preserve">Working draft. The Google Docs report is the master copy; this text is pasted there and kept in sync. Every table here is copied unchanged from reports/baseline_tables.md, which scripts/results_tables.py generates from reports/history.csv (all MLflow runs, exported by scripts/export_history.py). Every number cites its experiment (E01-E03 entries in reports/EXPERIMENT_LOG.md). Data version: v1. Code: tag v0.1.1-baseline (commit c450c3e), from which all 144 runs (80 baselines, 64 paper benchmark) were rerun with identical scores; the first runs came from commit 1817c5a (tag v0.1-baseline) and 36c56a1. Timings are from the rerun.</w:t>
       </w:r>
     </w:p>
     <w:p>
@@ -8536,7 +8536,7 @@
         <w:t xml:space="preserve">Cost.</w:t>
       </w:r>
       <w:r>
-        <w:t xml:space="preserve"> All baselines train in under 3 s. To predict 1,000 flows, the tree needs 0.30 ms (median), KNN 7.9 ms and the SVM 211 ms. Model files range from 1.4 KB (majority) and 4-5 KB (Logistic Regression) to 4.2 MB (SVM). Training times were measured with Python's memory tracer switched on, which slows fitting (x1.05 tree, x1.00 SVM, x1.19 Logistic Regression, x2.3 KNN in a recheck), so they are slight overestimates; the ranking doesn't change.</w:t>
+        <w:t xml:space="preserve"> All baselines train in under 3 s. To predict 1,000 flows, the tree needs 0.30 ms (median), KNN 8.0 ms and the SVM 210 ms. Model files range from 1.4 KB (majority) and 4-5 KB (Logistic Regression) to 4.2 MB (SVM).</w:t>
       </w:r>
     </w:p>
     <w:p>
@@ -16077,7 +16077,7 @@
                 <w:sz w:val="12"/>
                 <w:szCs w:val="12"/>
               </w:rPr>
-              <w:t xml:space="preserve">0.013</w:t>
+              <w:t xml:space="preserve">0.004</w:t>
             </w:r>
           </w:p>
         </w:tc>
@@ -16097,7 +16097,7 @@
                 <w:sz w:val="12"/>
                 <w:szCs w:val="12"/>
               </w:rPr>
-              <w:t xml:space="preserve">0.027</w:t>
+              <w:t xml:space="preserve">0.008</w:t>
             </w:r>
           </w:p>
         </w:tc>
@@ -16117,7 +16117,7 @@
                 <w:sz w:val="12"/>
                 <w:szCs w:val="12"/>
               </w:rPr>
-              <w:t xml:space="preserve">0.147</w:t>
+              <w:t xml:space="preserve">0.157</w:t>
             </w:r>
           </w:p>
         </w:tc>
@@ -16137,7 +16137,7 @@
                 <w:sz w:val="12"/>
                 <w:szCs w:val="12"/>
               </w:rPr>
-              <w:t xml:space="preserve">2.325</w:t>
+              <w:t xml:space="preserve">2.854</w:t>
             </w:r>
           </w:p>
         </w:tc>
@@ -16157,7 +16157,7 @@
                 <w:sz w:val="12"/>
                 <w:szCs w:val="12"/>
               </w:rPr>
-              <w:t xml:space="preserve">0.097</w:t>
+              <w:t xml:space="preserve">0.091</w:t>
             </w:r>
           </w:p>
         </w:tc>
@@ -16177,7 +16177,7 @@
                 <w:sz w:val="12"/>
                 <w:szCs w:val="12"/>
               </w:rPr>
-              <w:t xml:space="preserve">0.176</w:t>
+              <w:t xml:space="preserve">0.18</w:t>
             </w:r>
           </w:p>
         </w:tc>
@@ -16237,7 +16237,7 @@
                 <w:sz w:val="12"/>
                 <w:szCs w:val="12"/>
               </w:rPr>
-              <w:t xml:space="preserve">0.624</w:t>
+              <w:t xml:space="preserve">0.623</w:t>
             </w:r>
           </w:p>
         </w:tc>
@@ -16257,7 +16257,7 @@
                 <w:sz w:val="12"/>
                 <w:szCs w:val="12"/>
               </w:rPr>
-              <w:t xml:space="preserve">1.181</w:t>
+              <w:t xml:space="preserve">1.182</w:t>
             </w:r>
           </w:p>
         </w:tc>
@@ -16302,7 +16302,7 @@
                 <w:sz w:val="12"/>
                 <w:szCs w:val="12"/>
               </w:rPr>
-              <w:t xml:space="preserve">0.121</w:t>
+              <w:t xml:space="preserve">0.112</w:t>
             </w:r>
           </w:p>
         </w:tc>
@@ -16322,7 +16322,7 @@
                 <w:sz w:val="12"/>
                 <w:szCs w:val="12"/>
               </w:rPr>
-              <w:t xml:space="preserve">0.312</w:t>
+              <w:t xml:space="preserve">0.304</w:t>
             </w:r>
           </w:p>
         </w:tc>
@@ -16342,7 +16342,7 @@
                 <w:sz w:val="12"/>
                 <w:szCs w:val="12"/>
               </w:rPr>
-              <w:t xml:space="preserve">0.268</w:t>
+              <w:t xml:space="preserve">0.293</w:t>
             </w:r>
           </w:p>
         </w:tc>
@@ -16362,7 +16362,7 @@
                 <w:sz w:val="12"/>
                 <w:szCs w:val="12"/>
               </w:rPr>
-              <w:t xml:space="preserve">0.493</w:t>
+              <w:t xml:space="preserve">0.652</w:t>
             </w:r>
           </w:p>
         </w:tc>
@@ -16382,7 +16382,7 @@
                 <w:sz w:val="12"/>
                 <w:szCs w:val="12"/>
               </w:rPr>
-              <w:t xml:space="preserve">0.301</w:t>
+              <w:t xml:space="preserve">0.298</w:t>
             </w:r>
           </w:p>
         </w:tc>
@@ -16402,7 +16402,7 @@
                 <w:sz w:val="12"/>
                 <w:szCs w:val="12"/>
               </w:rPr>
-              <w:t xml:space="preserve">0.534</w:t>
+              <w:t xml:space="preserve">0.531</w:t>
             </w:r>
           </w:p>
         </w:tc>
@@ -16462,7 +16462,7 @@
                 <w:sz w:val="12"/>
                 <w:szCs w:val="12"/>
               </w:rPr>
-              <w:t xml:space="preserve">1.258</w:t>
+              <w:t xml:space="preserve">1.257</w:t>
             </w:r>
           </w:p>
         </w:tc>
@@ -16482,7 +16482,7 @@
                 <w:sz w:val="12"/>
                 <w:szCs w:val="12"/>
               </w:rPr>
-              <w:t xml:space="preserve">2.393</w:t>
+              <w:t xml:space="preserve">2.392</w:t>
             </w:r>
           </w:p>
         </w:tc>
@@ -16527,6 +16527,26 @@
                 <w:sz w:val="12"/>
                 <w:szCs w:val="12"/>
               </w:rPr>
+              <w:t xml:space="preserve">0.01</w:t>
+            </w:r>
+          </w:p>
+        </w:tc>
+        <w:tc>
+          <w:tcPr>
+            <w:tcW w:type="dxa" w:w="876"/>
+            <w:tcMar>
+              <w:top w:type="dxa" w:w="30"/>
+              <w:left w:type="dxa" w:w="60"/>
+              <w:bottom w:type="dxa" w:w="30"/>
+              <w:right w:type="dxa" w:w="60"/>
+            </w:tcMar>
+          </w:tcPr>
+          <w:p>
+            <w:r>
+              <w:rPr>
+                <w:sz w:val="12"/>
+                <w:szCs w:val="12"/>
+              </w:rPr>
               <w:t xml:space="preserve">0.021</w:t>
             </w:r>
           </w:p>
@@ -16547,7 +16567,7 @@
                 <w:sz w:val="12"/>
                 <w:szCs w:val="12"/>
               </w:rPr>
-              <w:t xml:space="preserve">0.042</w:t>
+              <w:t xml:space="preserve">0.182</w:t>
             </w:r>
           </w:p>
         </w:tc>
@@ -16567,7 +16587,7 @@
                 <w:sz w:val="12"/>
                 <w:szCs w:val="12"/>
               </w:rPr>
-              <w:t xml:space="preserve">0.187</w:t>
+              <w:t xml:space="preserve">0.281</w:t>
             </w:r>
           </w:p>
         </w:tc>
@@ -16587,7 +16607,7 @@
                 <w:sz w:val="12"/>
                 <w:szCs w:val="12"/>
               </w:rPr>
-              <w:t xml:space="preserve">0.258</w:t>
+              <w:t xml:space="preserve">8.031</w:t>
             </w:r>
           </w:p>
         </w:tc>
@@ -16607,7 +16627,7 @@
                 <w:sz w:val="12"/>
                 <w:szCs w:val="12"/>
               </w:rPr>
-              <w:t xml:space="preserve">7.856</w:t>
+              <w:t xml:space="preserve">13.338</w:t>
             </w:r>
           </w:p>
         </w:tc>
@@ -16627,7 +16647,7 @@
                 <w:sz w:val="12"/>
                 <w:szCs w:val="12"/>
               </w:rPr>
-              <w:t xml:space="preserve">29.5</w:t>
+              <w:t xml:space="preserve">1242.967</w:t>
             </w:r>
           </w:p>
         </w:tc>
@@ -16647,7 +16667,7 @@
                 <w:sz w:val="12"/>
                 <w:szCs w:val="12"/>
               </w:rPr>
-              <w:t xml:space="preserve">1242.967</w:t>
+              <w:t xml:space="preserve">2374.631</w:t>
             </w:r>
           </w:p>
         </w:tc>
@@ -16667,7 +16687,7 @@
                 <w:sz w:val="12"/>
                 <w:szCs w:val="12"/>
               </w:rPr>
-              <w:t xml:space="preserve">2374.631</w:t>
+              <w:t xml:space="preserve">2.999</w:t>
             </w:r>
           </w:p>
         </w:tc>
@@ -16687,27 +16707,7 @@
                 <w:sz w:val="12"/>
                 <w:szCs w:val="12"/>
               </w:rPr>
-              <w:t xml:space="preserve">3.003</w:t>
-            </w:r>
-          </w:p>
-        </w:tc>
-        <w:tc>
-          <w:tcPr>
-            <w:tcW w:type="dxa" w:w="876"/>
-            <w:tcMar>
-              <w:top w:type="dxa" w:w="30"/>
-              <w:left w:type="dxa" w:w="60"/>
-              <w:bottom w:type="dxa" w:w="30"/>
-              <w:right w:type="dxa" w:w="60"/>
-            </w:tcMar>
-          </w:tcPr>
-          <w:p>
-            <w:r>
-              <w:rPr>
-                <w:sz w:val="12"/>
-                <w:szCs w:val="12"/>
-              </w:rPr>
-              <w:t xml:space="preserve">5.733</w:t>
+              <w:t xml:space="preserve">5.722</w:t>
             </w:r>
           </w:p>
         </w:tc>
@@ -16752,7 +16752,7 @@
                 <w:sz w:val="12"/>
                 <w:szCs w:val="12"/>
               </w:rPr>
-              <w:t xml:space="preserve">0.116</w:t>
+              <w:t xml:space="preserve">0.084</w:t>
             </w:r>
           </w:p>
         </w:tc>
@@ -16772,7 +16772,7 @@
                 <w:sz w:val="12"/>
                 <w:szCs w:val="12"/>
               </w:rPr>
-              <w:t xml:space="preserve">0.461</w:t>
+              <w:t xml:space="preserve">0.428</w:t>
             </w:r>
           </w:p>
         </w:tc>
@@ -16792,7 +16792,7 @@
                 <w:sz w:val="12"/>
                 <w:szCs w:val="12"/>
               </w:rPr>
-              <w:t xml:space="preserve">0.201</w:t>
+              <w:t xml:space="preserve">0.212</w:t>
             </w:r>
           </w:p>
         </w:tc>
@@ -16812,7 +16812,7 @@
                 <w:sz w:val="12"/>
                 <w:szCs w:val="12"/>
               </w:rPr>
-              <w:t xml:space="preserve">0.604</w:t>
+              <w:t xml:space="preserve">0.603</w:t>
             </w:r>
           </w:p>
         </w:tc>
@@ -16832,7 +16832,7 @@
                 <w:sz w:val="12"/>
                 <w:szCs w:val="12"/>
               </w:rPr>
-              <w:t xml:space="preserve">0.364</w:t>
+              <w:t xml:space="preserve">0.378</w:t>
             </w:r>
           </w:p>
         </w:tc>
@@ -16852,7 +16852,7 @@
                 <w:sz w:val="12"/>
                 <w:szCs w:val="12"/>
               </w:rPr>
-              <w:t xml:space="preserve">0.684</w:t>
+              <w:t xml:space="preserve">0.69</w:t>
             </w:r>
           </w:p>
         </w:tc>
@@ -16912,7 +16912,7 @@
                 <w:sz w:val="12"/>
                 <w:szCs w:val="12"/>
               </w:rPr>
-              <w:t xml:space="preserve">3.432</w:t>
+              <w:t xml:space="preserve">3.433</w:t>
             </w:r>
           </w:p>
         </w:tc>
@@ -16932,7 +16932,7 @@
                 <w:sz w:val="12"/>
                 <w:szCs w:val="12"/>
               </w:rPr>
-              <w:t xml:space="preserve">8.147</w:t>
+              <w:t xml:space="preserve">8.144</w:t>
             </w:r>
           </w:p>
         </w:tc>
@@ -16977,7 +16977,7 @@
                 <w:sz w:val="12"/>
                 <w:szCs w:val="12"/>
               </w:rPr>
-              <w:t xml:space="preserve">0.636</w:t>
+              <w:t xml:space="preserve">0.626</w:t>
             </w:r>
           </w:p>
         </w:tc>
@@ -16997,7 +16997,7 @@
                 <w:sz w:val="12"/>
                 <w:szCs w:val="12"/>
               </w:rPr>
-              <w:t xml:space="preserve">2.939</w:t>
+              <w:t xml:space="preserve">2.913</w:t>
             </w:r>
           </w:p>
         </w:tc>
@@ -17017,7 +17017,7 @@
                 <w:sz w:val="12"/>
                 <w:szCs w:val="12"/>
               </w:rPr>
-              <w:t xml:space="preserve">2.05</w:t>
+              <w:t xml:space="preserve">1.61</w:t>
             </w:r>
           </w:p>
         </w:tc>
@@ -17037,7 +17037,7 @@
                 <w:sz w:val="12"/>
                 <w:szCs w:val="12"/>
               </w:rPr>
-              <w:t xml:space="preserve">3.849</w:t>
+              <w:t xml:space="preserve">3.784</w:t>
             </w:r>
           </w:p>
         </w:tc>
@@ -17057,7 +17057,7 @@
                 <w:sz w:val="12"/>
                 <w:szCs w:val="12"/>
               </w:rPr>
-              <w:t xml:space="preserve">211.011</w:t>
+              <w:t xml:space="preserve">209.808</w:t>
             </w:r>
           </w:p>
         </w:tc>
@@ -17077,7 +17077,7 @@
                 <w:sz w:val="12"/>
                 <w:szCs w:val="12"/>
               </w:rPr>
-              <w:t xml:space="preserve">599.119</w:t>
+              <w:t xml:space="preserve">596.678</w:t>
             </w:r>
           </w:p>
         </w:tc>
@@ -17137,7 +17137,7 @@
                 <w:sz w:val="12"/>
                 <w:szCs w:val="12"/>
               </w:rPr>
-              <w:t xml:space="preserve">3.554</w:t>
+              <w:t xml:space="preserve">3.552</w:t>
             </w:r>
           </w:p>
         </w:tc>
@@ -17157,7 +17157,7 @@
                 <w:sz w:val="12"/>
                 <w:szCs w:val="12"/>
               </w:rPr>
-              <w:t xml:space="preserve">7.783</w:t>
+              <w:t xml:space="preserve">7.781</w:t>
             </w:r>
           </w:p>
         </w:tc>
@@ -17169,7 +17169,7 @@
         <w:spacing w:after="120"/>
       </w:pPr>
       <w:r>
-        <w:t xml:space="preserve">Peak fit memory is measured with Python's tracemalloc, which counts NumPy arrays but not memory allocated inside compiled libraries (for example libsvm), so SVM memory is a lower bound. In these Phase 2 runs the timed fit also ran with tracemalloc on, which slows fitting: in a recheck (B 15 s, median of 5 fits) by x1.05 for the tree, x1.00 for the SVM, x1.19 for Logistic Regression and x2.3 for KNN (0.012 s -&gt; 0.027 s). So the training times above are slight overestimates; from Phase 3 on, time and memory come from separate fits. The metric process_max_rss_mb in these runs is the high-water mark of the whole batch process (it only grows from run to run), not a per-run figure; it is not used and is no longer logged.</w:t>
+        <w:t xml:space="preserve">Peak fit memory is measured with Python's tracemalloc, which counts NumPy arrays but not memory allocated inside compiled libraries (for example libsvm), so SVM memory is a lower bound. Training time comes from a fit without tracemalloc and peak memory from a separate fit of a clone. The first Phase 2 runs (commits 1817c5a and 36c56a1) timed the fit with tracemalloc on, which slowed it (x1.05 tree, x1.00 SVM, x1.19 Logistic Regression, x2.3 KNN in a recheck); all 144 configs were rerun from the fixed code (commit c450c3e) with identical scores, and these tables use the rerun. The first runs also logged process_max_rss_mb, a high-water mark of the whole batch process rather than a per-run figure; it is not used.</w:t>
       </w:r>
     </w:p>
     <w:p>
@@ -54295,7 +54295,7 @@
         <w:spacing w:after="120"/>
       </w:pPr>
       <w:r>
-        <w:t xml:space="preserve">Every official run saves its trained model (the plan's rule). After the 147 runs so far (80 baselines, 64 benchmark, 2 pilot, 1 setup check), the MLflow store holds 137.8 MB of artifacts and a 5.8 MB database; the largest single run is 4.3 MB (SVM). Per model type:</w:t>
+        <w:t xml:space="preserve">Every official run saves its trained model (the plan's rule). After the first 147 runs (80 baselines, 64 benchmark, 2 pilot, 1 setup check), the MLflow store held 137.8 MB of artifacts and a 5.8 MB database (275.2 MB and 10.4 MB after the timing rerun of all 144 configs); the largest single run is 4.3 MB (SVM). Per model type:</w:t>
       </w:r>
     </w:p>
     <w:tbl>
@@ -55179,7 +55179,7 @@
         <w:spacing w:after="120"/>
       </w:pPr>
       <w:r>
-        <w:t xml:space="preserve">Whole store now: artifacts 137.8 MB, mlflow.db 5.8 MB.</w:t>
+        <w:t xml:space="preserve">Whole store now (after the rerun): artifacts 275.2 MB, mlflow.db 10.4 MB.</w:t>
       </w:r>
     </w:p>
     <w:p>

</xml_diff>